<commit_message>
Updated status of preprints.
</commit_message>
<xml_diff>
--- a/assets/cv/CV.docx
+++ b/assets/cv/CV.docx
@@ -302,7 +302,23 @@
           <w:rFonts w:ascii="Arial" w:hAnsi="Arial" w:cs="Arial"/>
           <w:szCs w:val="18"/>
         </w:rPr>
-        <w:t>xperience in Bayesian inference, Bayesian model selection, global sensitivity analysis, multifidelity UQ, and model-form uncertainty</w:t>
+        <w:t xml:space="preserve">xperience in Bayesian inference, Bayesian model selection, global sensitivity analysis, </w:t>
+      </w:r>
+      <w:proofErr w:type="spellStart"/>
+      <w:r>
+        <w:rPr>
+          <w:rFonts w:ascii="Arial" w:hAnsi="Arial" w:cs="Arial"/>
+          <w:szCs w:val="18"/>
+        </w:rPr>
+        <w:t>multifidelity</w:t>
+      </w:r>
+      <w:proofErr w:type="spellEnd"/>
+      <w:r>
+        <w:rPr>
+          <w:rFonts w:ascii="Arial" w:hAnsi="Arial" w:cs="Arial"/>
+          <w:szCs w:val="18"/>
+        </w:rPr>
+        <w:t xml:space="preserve"> UQ, and model-form uncertainty</w:t>
       </w:r>
       <w:r>
         <w:rPr>
@@ -533,7 +549,23 @@
           <w:rFonts w:ascii="Arial" w:hAnsi="Arial" w:cs="Arial"/>
           <w:szCs w:val="18"/>
         </w:rPr>
-        <w:t xml:space="preserve">applications, and disease modeling. Particular focus on Bayesian inference, </w:t>
+        <w:t xml:space="preserve">applications, and disease modeling. </w:t>
+      </w:r>
+      <w:proofErr w:type="gramStart"/>
+      <w:r>
+        <w:rPr>
+          <w:rFonts w:ascii="Arial" w:hAnsi="Arial" w:cs="Arial"/>
+          <w:szCs w:val="18"/>
+        </w:rPr>
+        <w:t>Particular focus</w:t>
+      </w:r>
+      <w:proofErr w:type="gramEnd"/>
+      <w:r>
+        <w:rPr>
+          <w:rFonts w:ascii="Arial" w:hAnsi="Arial" w:cs="Arial"/>
+          <w:szCs w:val="18"/>
+        </w:rPr>
+        <w:t xml:space="preserve"> on Bayesian inference, </w:t>
       </w:r>
       <w:r>
         <w:rPr>
@@ -556,12 +588,21 @@
         </w:rPr>
         <w:t xml:space="preserve">, and </w:t>
       </w:r>
-      <w:r>
-        <w:rPr>
-          <w:rFonts w:ascii="Arial" w:hAnsi="Arial" w:cs="Arial"/>
-          <w:szCs w:val="18"/>
-        </w:rPr>
-        <w:t>multifidelity UQ</w:t>
+      <w:proofErr w:type="spellStart"/>
+      <w:r>
+        <w:rPr>
+          <w:rFonts w:ascii="Arial" w:hAnsi="Arial" w:cs="Arial"/>
+          <w:szCs w:val="18"/>
+        </w:rPr>
+        <w:t>multifidelity</w:t>
+      </w:r>
+      <w:proofErr w:type="spellEnd"/>
+      <w:r>
+        <w:rPr>
+          <w:rFonts w:ascii="Arial" w:hAnsi="Arial" w:cs="Arial"/>
+          <w:szCs w:val="18"/>
+        </w:rPr>
+        <w:t xml:space="preserve"> UQ</w:t>
       </w:r>
       <w:r>
         <w:rPr>
@@ -808,6 +849,13 @@
           <w:rFonts w:ascii="Arial" w:hAnsi="Arial" w:cs="Arial"/>
           <w:lang w:val="en-US"/>
         </w:rPr>
+        <w:t xml:space="preserve">UNDER REVIEW + ARXIV </w:t>
+      </w:r>
+      <w:r>
+        <w:rPr>
+          <w:rFonts w:ascii="Arial" w:hAnsi="Arial" w:cs="Arial"/>
+          <w:lang w:val="en-US"/>
+        </w:rPr>
         <w:t>P</w:t>
       </w:r>
       <w:r>
@@ -817,13 +865,15 @@
         </w:rPr>
         <w:t>REPRINT</w:t>
       </w:r>
-    </w:p>
-    <w:p>
-      <w:pPr>
-        <w:rPr>
-          <w:lang w:val="en-US"/>
-        </w:rPr>
-      </w:pPr>
+      <w:r>
+        <w:rPr>
+          <w:rFonts w:ascii="Arial" w:hAnsi="Arial" w:cs="Arial"/>
+          <w:lang w:val="en-US"/>
+        </w:rPr>
+        <w:t>S</w:t>
+      </w:r>
+    </w:p>
+    <w:p>
       <w:r>
         <w:rPr>
           <w:lang w:val="en-US"/>
@@ -867,17 +917,32 @@
           <w:t>https://doi.org/10.48550/arXiv.2601.04396</w:t>
         </w:r>
       </w:hyperlink>
-      <w:r>
-        <w:rPr>
-          <w:lang w:val="en-US"/>
-        </w:rPr>
-        <w:br/>
-      </w:r>
-      <w:r>
-        <w:rPr>
-          <w:lang w:val="en-US"/>
-        </w:rPr>
-        <w:t xml:space="preserve">Bandy, R., Morrison, R., Mussoni, E., &amp; </w:t>
+    </w:p>
+    <w:p>
+      <w:pPr>
+        <w:rPr>
+          <w:lang w:val="en-US"/>
+        </w:rPr>
+      </w:pPr>
+      <w:r>
+        <w:rPr>
+          <w:lang w:val="en-US"/>
+        </w:rPr>
+        <w:t xml:space="preserve">Bandy, R., Morrison, R., </w:t>
+      </w:r>
+      <w:proofErr w:type="spellStart"/>
+      <w:r>
+        <w:rPr>
+          <w:lang w:val="en-US"/>
+        </w:rPr>
+        <w:t>Mussoni</w:t>
+      </w:r>
+      <w:proofErr w:type="spellEnd"/>
+      <w:r>
+        <w:rPr>
+          <w:lang w:val="en-US"/>
+        </w:rPr>
+        <w:t xml:space="preserve">, E., &amp; </w:t>
       </w:r>
       <w:r>
         <w:rPr>
@@ -941,7 +1006,21 @@
         <w:rPr>
           <w:lang w:val="en-US"/>
         </w:rPr>
-        <w:t xml:space="preserve">, Chkrebtii, O., &amp; Neal, K. (2025). </w:t>
+        <w:t xml:space="preserve">, </w:t>
+      </w:r>
+      <w:proofErr w:type="spellStart"/>
+      <w:r>
+        <w:rPr>
+          <w:lang w:val="en-US"/>
+        </w:rPr>
+        <w:t>Chkrebtii</w:t>
+      </w:r>
+      <w:proofErr w:type="spellEnd"/>
+      <w:r>
+        <w:rPr>
+          <w:lang w:val="en-US"/>
+        </w:rPr>
+        <w:t xml:space="preserve">, O., &amp; Neal, K. (2025). </w:t>
       </w:r>
       <w:r>
         <w:rPr>
@@ -1010,6 +1089,9 @@
           <w:t>https://arxiv.org/abs/2509.09078</w:t>
         </w:r>
       </w:hyperlink>
+      <w:r>
+        <w:t>. Under review at International Journal of Uncertainty Quantification.</w:t>
+      </w:r>
     </w:p>
     <w:p>
       <w:pPr>
@@ -1058,7 +1140,10 @@
         <w:rPr>
           <w:lang w:val="en-US"/>
         </w:rPr>
-        <w:t xml:space="preserve"> </w:t>
+        <w:t xml:space="preserve">. </w:t>
+      </w:r>
+      <w:r>
+        <w:t>Under review of Journal of Computational Physics.</w:t>
       </w:r>
     </w:p>
     <w:p>
@@ -1103,6 +1188,7 @@
           <w:szCs w:val="18"/>
           <w:lang w:val="en-US"/>
         </w:rPr>
+        <w:lastRenderedPageBreak/>
         <w:t>Portone, T.</w:t>
       </w:r>
       <w:r>
@@ -1169,7 +1255,6 @@
           <w:szCs w:val="18"/>
           <w:lang w:val="en-US"/>
         </w:rPr>
-        <w:lastRenderedPageBreak/>
         <w:t xml:space="preserve">Brooks, D. M., Swiler, L. P., Stein, E., Mariner, P. E., Basurto, E., </w:t>
       </w:r>
       <w:r>
@@ -1825,7 +1910,21 @@
         <w:rPr>
           <w:lang w:val="en-US"/>
         </w:rPr>
-        <w:t xml:space="preserve">, Eldred, Mike, Geraci, Gianluca, &amp; Swiler, Laura P. (2022). Multimodel Methods for Uncertainty Quantification of Repository Systems. </w:t>
+        <w:t xml:space="preserve">, Eldred, Mike, Geraci, Gianluca, &amp; Swiler, Laura P. (2022). </w:t>
+      </w:r>
+      <w:proofErr w:type="spellStart"/>
+      <w:r>
+        <w:rPr>
+          <w:lang w:val="en-US"/>
+        </w:rPr>
+        <w:t>Multimodel</w:t>
+      </w:r>
+      <w:proofErr w:type="spellEnd"/>
+      <w:r>
+        <w:rPr>
+          <w:lang w:val="en-US"/>
+        </w:rPr>
+        <w:t xml:space="preserve"> Methods for Uncertainty Quantification of Repository Systems. </w:t>
       </w:r>
       <w:r>
         <w:rPr>
@@ -2060,6 +2159,7 @@
         <w:rPr>
           <w:lang w:val="en-US"/>
         </w:rPr>
+        <w:lastRenderedPageBreak/>
         <w:t xml:space="preserve">Swiler, L. P., Basurto, E., Brooks, D. M., LaForce, T., Leone, R., Mariner, P. E., </w:t>
       </w:r>
       <w:r>
@@ -2110,7 +2210,6 @@
         <w:rPr>
           <w:lang w:val="en-US"/>
         </w:rPr>
-        <w:lastRenderedPageBreak/>
         <w:t xml:space="preserve">Swiler, L. P., Brooks, D. M., </w:t>
       </w:r>
       <w:r>
@@ -2201,11 +2300,19 @@
           <w:lang w:val="en-US"/>
         </w:rPr>
       </w:pPr>
-      <w:r>
-        <w:rPr>
-          <w:lang w:val="en-US"/>
-        </w:rPr>
-        <w:t xml:space="preserve">Acquesta, E., </w:t>
+      <w:proofErr w:type="spellStart"/>
+      <w:r>
+        <w:rPr>
+          <w:lang w:val="en-US"/>
+        </w:rPr>
+        <w:t>Acquesta</w:t>
+      </w:r>
+      <w:proofErr w:type="spellEnd"/>
+      <w:r>
+        <w:rPr>
+          <w:lang w:val="en-US"/>
+        </w:rPr>
+        <w:t xml:space="preserve">, E., </w:t>
       </w:r>
       <w:r>
         <w:rPr>
@@ -2233,7 +2340,21 @@
         <w:rPr>
           <w:lang w:val="en-US"/>
         </w:rPr>
-        <w:t xml:space="preserve"> (SAND2022-12823). Sandia National Lab.(SNL-NM), Albuquerque, NM (United States). </w:t>
+        <w:t xml:space="preserve"> (SAND2022-12823). Sandia National </w:t>
+      </w:r>
+      <w:proofErr w:type="gramStart"/>
+      <w:r>
+        <w:rPr>
+          <w:lang w:val="en-US"/>
+        </w:rPr>
+        <w:t>Lab.(</w:t>
+      </w:r>
+      <w:proofErr w:type="gramEnd"/>
+      <w:r>
+        <w:rPr>
+          <w:lang w:val="en-US"/>
+        </w:rPr>
+        <w:t xml:space="preserve">SNL-NM), Albuquerque, NM (United States). </w:t>
       </w:r>
       <w:hyperlink r:id="rId30" w:history="1">
         <w:r>
@@ -2277,7 +2398,25 @@
           <w:iCs/>
           <w:lang w:val="en-US"/>
         </w:rPr>
-        <w:t>Deployment of Multifidelity Uncertainty Quantification for Thermal Battery Assessment Part I: Algorithms and Single Cell Results</w:t>
+        <w:t xml:space="preserve">Deployment of </w:t>
+      </w:r>
+      <w:proofErr w:type="spellStart"/>
+      <w:r>
+        <w:rPr>
+          <w:i/>
+          <w:iCs/>
+          <w:lang w:val="en-US"/>
+        </w:rPr>
+        <w:t>Multifidelity</w:t>
+      </w:r>
+      <w:proofErr w:type="spellEnd"/>
+      <w:r>
+        <w:rPr>
+          <w:i/>
+          <w:iCs/>
+          <w:lang w:val="en-US"/>
+        </w:rPr>
+        <w:t xml:space="preserve"> Uncertainty Quantification for Thermal Battery Assessment Part I: Algorithms and Single Cell Results</w:t>
       </w:r>
       <w:r>
         <w:rPr>
@@ -2505,7 +2644,21 @@
         <w:rPr>
           <w:lang w:val="en-US"/>
         </w:rPr>
-        <w:t xml:space="preserve">Safta, C., Ray, J., Acquesta, E., Catanach, T. A., Chowdhary, K. S., Debusschere, B., Galvan, E., Geraci, G., Khalil, M., &amp; </w:t>
+        <w:t xml:space="preserve">Safta, C., Ray, J., </w:t>
+      </w:r>
+      <w:proofErr w:type="spellStart"/>
+      <w:r>
+        <w:rPr>
+          <w:lang w:val="en-US"/>
+        </w:rPr>
+        <w:t>Acquesta</w:t>
+      </w:r>
+      <w:proofErr w:type="spellEnd"/>
+      <w:r>
+        <w:rPr>
+          <w:lang w:val="en-US"/>
+        </w:rPr>
+        <w:t xml:space="preserve">, E., Catanach, T. A., Chowdhary, K. S., Debusschere, B., Galvan, E., Geraci, G., Khalil, M., &amp; </w:t>
       </w:r>
       <w:r>
         <w:rPr>
@@ -2877,6 +3030,7 @@
           <w:i/>
           <w:szCs w:val="18"/>
         </w:rPr>
+        <w:lastRenderedPageBreak/>
         <w:t xml:space="preserve">A brief survey of uncertainty quantification. </w:t>
       </w:r>
       <w:r>
@@ -2988,7 +3142,6 @@
         <w:rPr>
           <w:rFonts w:ascii="Arial" w:hAnsi="Arial" w:cs="Arial"/>
         </w:rPr>
-        <w:lastRenderedPageBreak/>
         <w:t>CONFERENCE AND OTHER</w:t>
       </w:r>
     </w:p>
@@ -3371,13 +3524,23 @@
           <w:szCs w:val="18"/>
         </w:rPr>
       </w:pPr>
-      <w:r>
-        <w:rPr>
-          <w:rFonts w:ascii="Arial" w:hAnsi="Arial" w:cs="Arial"/>
-          <w:i/>
-          <w:szCs w:val="18"/>
-        </w:rPr>
-        <w:t xml:space="preserve">Multimodel Methods for Uncertainty Quantification of Repository Systems. </w:t>
+      <w:proofErr w:type="spellStart"/>
+      <w:r>
+        <w:rPr>
+          <w:rFonts w:ascii="Arial" w:hAnsi="Arial" w:cs="Arial"/>
+          <w:i/>
+          <w:szCs w:val="18"/>
+        </w:rPr>
+        <w:t>Multimodel</w:t>
+      </w:r>
+      <w:proofErr w:type="spellEnd"/>
+      <w:r>
+        <w:rPr>
+          <w:rFonts w:ascii="Arial" w:hAnsi="Arial" w:cs="Arial"/>
+          <w:i/>
+          <w:szCs w:val="18"/>
+        </w:rPr>
+        <w:t xml:space="preserve"> Methods for Uncertainty Quantification of Repository Systems. </w:t>
       </w:r>
       <w:r>
         <w:rPr>
@@ -3441,7 +3604,27 @@
           <w:szCs w:val="18"/>
           <w:lang w:val="en-US"/>
         </w:rPr>
-        <w:t xml:space="preserve"> T. Portone, E. Acquesta, R. Dandekar, C. Rackauckas. 8</w:t>
+        <w:t xml:space="preserve"> T. Portone, E. </w:t>
+      </w:r>
+      <w:proofErr w:type="spellStart"/>
+      <w:r>
+        <w:rPr>
+          <w:rFonts w:ascii="Arial" w:hAnsi="Arial" w:cs="Arial"/>
+          <w:iCs/>
+          <w:szCs w:val="18"/>
+          <w:lang w:val="en-US"/>
+        </w:rPr>
+        <w:t>Acquesta</w:t>
+      </w:r>
+      <w:proofErr w:type="spellEnd"/>
+      <w:r>
+        <w:rPr>
+          <w:rFonts w:ascii="Arial" w:hAnsi="Arial" w:cs="Arial"/>
+          <w:iCs/>
+          <w:szCs w:val="18"/>
+          <w:lang w:val="en-US"/>
+        </w:rPr>
+        <w:t>, R. Dandekar, C. Rackauckas. 8</w:t>
       </w:r>
       <w:r>
         <w:rPr>
@@ -3518,7 +3701,27 @@
           <w:szCs w:val="18"/>
           <w:lang w:val="en-US"/>
         </w:rPr>
-        <w:t>T. Portone, E. Acquesta, R. Dandekar, C. Rackauckas. USNCCM16, Virtual, July 2021.</w:t>
+        <w:t xml:space="preserve">T. Portone, E. </w:t>
+      </w:r>
+      <w:proofErr w:type="spellStart"/>
+      <w:r>
+        <w:rPr>
+          <w:rFonts w:ascii="Arial" w:hAnsi="Arial" w:cs="Arial"/>
+          <w:iCs/>
+          <w:szCs w:val="18"/>
+          <w:lang w:val="en-US"/>
+        </w:rPr>
+        <w:t>Acquesta</w:t>
+      </w:r>
+      <w:proofErr w:type="spellEnd"/>
+      <w:r>
+        <w:rPr>
+          <w:rFonts w:ascii="Arial" w:hAnsi="Arial" w:cs="Arial"/>
+          <w:iCs/>
+          <w:szCs w:val="18"/>
+          <w:lang w:val="en-US"/>
+        </w:rPr>
+        <w:t>, R. Dandekar, C. Rackauckas. USNCCM16, Virtual, July 2021.</w:t>
       </w:r>
     </w:p>
     <w:p>
@@ -3538,7 +3741,27 @@
           <w:szCs w:val="18"/>
           <w:lang w:val="en-US"/>
         </w:rPr>
-        <w:t xml:space="preserve">Application of Multifidelity Uncertainty Quantification Methods to a Subsurface Transport Model. </w:t>
+        <w:t xml:space="preserve">Application of </w:t>
+      </w:r>
+      <w:proofErr w:type="spellStart"/>
+      <w:r>
+        <w:rPr>
+          <w:rFonts w:ascii="Arial" w:hAnsi="Arial" w:cs="Arial"/>
+          <w:i/>
+          <w:szCs w:val="18"/>
+          <w:lang w:val="en-US"/>
+        </w:rPr>
+        <w:t>Multifidelity</w:t>
+      </w:r>
+      <w:proofErr w:type="spellEnd"/>
+      <w:r>
+        <w:rPr>
+          <w:rFonts w:ascii="Arial" w:hAnsi="Arial" w:cs="Arial"/>
+          <w:i/>
+          <w:szCs w:val="18"/>
+          <w:lang w:val="en-US"/>
+        </w:rPr>
+        <w:t xml:space="preserve"> Uncertainty Quantification Methods to a Subsurface Transport Model. </w:t>
       </w:r>
       <w:r>
         <w:rPr>
@@ -3691,7 +3914,23 @@
           <w:rFonts w:ascii="Arial" w:hAnsi="Arial" w:cs="Arial"/>
           <w:szCs w:val="18"/>
         </w:rPr>
-        <w:t>T. Portone, D. McDougall, J. Rigelo, T. Oliver, R.D. Moser. SIAM UQ 2016, Lausanne, Switzerland, April 2016.</w:t>
+        <w:t xml:space="preserve">T. Portone, D. McDougall, J. </w:t>
+      </w:r>
+      <w:proofErr w:type="spellStart"/>
+      <w:r>
+        <w:rPr>
+          <w:rFonts w:ascii="Arial" w:hAnsi="Arial" w:cs="Arial"/>
+          <w:szCs w:val="18"/>
+        </w:rPr>
+        <w:t>Rigelo</w:t>
+      </w:r>
+      <w:proofErr w:type="spellEnd"/>
+      <w:r>
+        <w:rPr>
+          <w:rFonts w:ascii="Arial" w:hAnsi="Arial" w:cs="Arial"/>
+          <w:szCs w:val="18"/>
+        </w:rPr>
+        <w:t>, T. Oliver, R.D. Moser. SIAM UQ 2016, Lausanne, Switzerland, April 2016.</w:t>
       </w:r>
     </w:p>
     <w:p>
@@ -3720,6 +3959,7 @@
           <w:sz w:val="24"/>
           <w:szCs w:val="24"/>
         </w:rPr>
+        <w:lastRenderedPageBreak/>
         <w:t>AWARDS</w:t>
       </w:r>
     </w:p>
@@ -3865,7 +4105,6 @@
                 <w:rFonts w:ascii="Arial" w:hAnsi="Arial" w:cs="Arial"/>
                 <w:szCs w:val="18"/>
               </w:rPr>
-              <w:lastRenderedPageBreak/>
               <w:t>2021</w:t>
             </w:r>
           </w:p>
@@ -5037,7 +5276,25 @@
                 <w:szCs w:val="18"/>
                 <w:lang w:val="en-US"/>
               </w:rPr>
-              <w:t>; International Journal of Uncertainty Quantification; International Journal of High Performance Computing Applications; International Journal of Multiscale Computational Engineering</w:t>
+              <w:t xml:space="preserve">; International Journal of Uncertainty Quantification; International Journal of </w:t>
+            </w:r>
+            <w:proofErr w:type="gramStart"/>
+            <w:r>
+              <w:rPr>
+                <w:rFonts w:ascii="Arial" w:hAnsi="Arial" w:cs="Arial"/>
+                <w:szCs w:val="18"/>
+                <w:lang w:val="en-US"/>
+              </w:rPr>
+              <w:t>High Performance</w:t>
+            </w:r>
+            <w:proofErr w:type="gramEnd"/>
+            <w:r>
+              <w:rPr>
+                <w:rFonts w:ascii="Arial" w:hAnsi="Arial" w:cs="Arial"/>
+                <w:szCs w:val="18"/>
+                <w:lang w:val="en-US"/>
+              </w:rPr>
+              <w:t xml:space="preserve"> Computing Applications; International Journal of Multiscale Computational Engineering</w:t>
             </w:r>
           </w:p>
         </w:tc>
@@ -5883,6 +6140,7 @@
   <w:style w:type="character" w:default="1" w:styleId="DefaultParagraphFont">
     <w:name w:val="Default Paragraph Font"/>
     <w:uiPriority w:val="1"/>
+    <w:semiHidden/>
     <w:unhideWhenUsed/>
   </w:style>
   <w:style w:type="table" w:default="1" w:styleId="TableNormal">

</xml_diff>

<commit_message>
Updated to reflect IJUQ review for Rileigh paper.
</commit_message>
<xml_diff>
--- a/assets/cv/CV.docx
+++ b/assets/cv/CV.docx
@@ -302,23 +302,7 @@
           <w:rFonts w:ascii="Arial" w:hAnsi="Arial" w:cs="Arial"/>
           <w:szCs w:val="18"/>
         </w:rPr>
-        <w:t xml:space="preserve">xperience in Bayesian inference, Bayesian model selection, global sensitivity analysis, </w:t>
-      </w:r>
-      <w:proofErr w:type="spellStart"/>
-      <w:r>
-        <w:rPr>
-          <w:rFonts w:ascii="Arial" w:hAnsi="Arial" w:cs="Arial"/>
-          <w:szCs w:val="18"/>
-        </w:rPr>
-        <w:t>multifidelity</w:t>
-      </w:r>
-      <w:proofErr w:type="spellEnd"/>
-      <w:r>
-        <w:rPr>
-          <w:rFonts w:ascii="Arial" w:hAnsi="Arial" w:cs="Arial"/>
-          <w:szCs w:val="18"/>
-        </w:rPr>
-        <w:t xml:space="preserve"> UQ, and model-form uncertainty</w:t>
+        <w:t>xperience in Bayesian inference, Bayesian model selection, global sensitivity analysis, multifidelity UQ, and model-form uncertainty</w:t>
       </w:r>
       <w:r>
         <w:rPr>
@@ -549,23 +533,7 @@
           <w:rFonts w:ascii="Arial" w:hAnsi="Arial" w:cs="Arial"/>
           <w:szCs w:val="18"/>
         </w:rPr>
-        <w:t xml:space="preserve">applications, and disease modeling. </w:t>
-      </w:r>
-      <w:proofErr w:type="gramStart"/>
-      <w:r>
-        <w:rPr>
-          <w:rFonts w:ascii="Arial" w:hAnsi="Arial" w:cs="Arial"/>
-          <w:szCs w:val="18"/>
-        </w:rPr>
-        <w:t>Particular focus</w:t>
-      </w:r>
-      <w:proofErr w:type="gramEnd"/>
-      <w:r>
-        <w:rPr>
-          <w:rFonts w:ascii="Arial" w:hAnsi="Arial" w:cs="Arial"/>
-          <w:szCs w:val="18"/>
-        </w:rPr>
-        <w:t xml:space="preserve"> on Bayesian inference, </w:t>
+        <w:t xml:space="preserve">applications, and disease modeling. Particular focus on Bayesian inference, </w:t>
       </w:r>
       <w:r>
         <w:rPr>
@@ -588,21 +556,12 @@
         </w:rPr>
         <w:t xml:space="preserve">, and </w:t>
       </w:r>
-      <w:proofErr w:type="spellStart"/>
-      <w:r>
-        <w:rPr>
-          <w:rFonts w:ascii="Arial" w:hAnsi="Arial" w:cs="Arial"/>
-          <w:szCs w:val="18"/>
-        </w:rPr>
-        <w:t>multifidelity</w:t>
-      </w:r>
-      <w:proofErr w:type="spellEnd"/>
-      <w:r>
-        <w:rPr>
-          <w:rFonts w:ascii="Arial" w:hAnsi="Arial" w:cs="Arial"/>
-          <w:szCs w:val="18"/>
-        </w:rPr>
-        <w:t xml:space="preserve"> UQ</w:t>
+      <w:r>
+        <w:rPr>
+          <w:rFonts w:ascii="Arial" w:hAnsi="Arial" w:cs="Arial"/>
+          <w:szCs w:val="18"/>
+        </w:rPr>
+        <w:t>multifidelity UQ</w:t>
       </w:r>
       <w:r>
         <w:rPr>
@@ -928,21 +887,7 @@
         <w:rPr>
           <w:lang w:val="en-US"/>
         </w:rPr>
-        <w:t xml:space="preserve">Bandy, R., Morrison, R., </w:t>
-      </w:r>
-      <w:proofErr w:type="spellStart"/>
-      <w:r>
-        <w:rPr>
-          <w:lang w:val="en-US"/>
-        </w:rPr>
-        <w:t>Mussoni</w:t>
-      </w:r>
-      <w:proofErr w:type="spellEnd"/>
-      <w:r>
-        <w:rPr>
-          <w:lang w:val="en-US"/>
-        </w:rPr>
-        <w:t xml:space="preserve">, E., &amp; </w:t>
+        <w:t xml:space="preserve">Bandy, R., Morrison, R., Mussoni, E., &amp; </w:t>
       </w:r>
       <w:r>
         <w:rPr>
@@ -981,6 +926,9 @@
           <w:t>https://arxiv.org/abs/2509.08137</w:t>
         </w:r>
       </w:hyperlink>
+      <w:r>
+        <w:t>. Under review at International Journal of Uncertainty Quantification.</w:t>
+      </w:r>
     </w:p>
     <w:p>
       <w:pPr>
@@ -1006,21 +954,7 @@
         <w:rPr>
           <w:lang w:val="en-US"/>
         </w:rPr>
-        <w:t xml:space="preserve">, </w:t>
-      </w:r>
-      <w:proofErr w:type="spellStart"/>
-      <w:r>
-        <w:rPr>
-          <w:lang w:val="en-US"/>
-        </w:rPr>
-        <w:t>Chkrebtii</w:t>
-      </w:r>
-      <w:proofErr w:type="spellEnd"/>
-      <w:r>
-        <w:rPr>
-          <w:lang w:val="en-US"/>
-        </w:rPr>
-        <w:t xml:space="preserve">, O., &amp; Neal, K. (2025). </w:t>
+        <w:t xml:space="preserve">, Chkrebtii, O., &amp; Neal, K. (2025). </w:t>
       </w:r>
       <w:r>
         <w:rPr>
@@ -1910,21 +1844,7 @@
         <w:rPr>
           <w:lang w:val="en-US"/>
         </w:rPr>
-        <w:t xml:space="preserve">, Eldred, Mike, Geraci, Gianluca, &amp; Swiler, Laura P. (2022). </w:t>
-      </w:r>
-      <w:proofErr w:type="spellStart"/>
-      <w:r>
-        <w:rPr>
-          <w:lang w:val="en-US"/>
-        </w:rPr>
-        <w:t>Multimodel</w:t>
-      </w:r>
-      <w:proofErr w:type="spellEnd"/>
-      <w:r>
-        <w:rPr>
-          <w:lang w:val="en-US"/>
-        </w:rPr>
-        <w:t xml:space="preserve"> Methods for Uncertainty Quantification of Repository Systems. </w:t>
+        <w:t xml:space="preserve">, Eldred, Mike, Geraci, Gianluca, &amp; Swiler, Laura P. (2022). Multimodel Methods for Uncertainty Quantification of Repository Systems. </w:t>
       </w:r>
       <w:r>
         <w:rPr>
@@ -2300,19 +2220,11 @@
           <w:lang w:val="en-US"/>
         </w:rPr>
       </w:pPr>
-      <w:proofErr w:type="spellStart"/>
-      <w:r>
-        <w:rPr>
-          <w:lang w:val="en-US"/>
-        </w:rPr>
-        <w:t>Acquesta</w:t>
-      </w:r>
-      <w:proofErr w:type="spellEnd"/>
-      <w:r>
-        <w:rPr>
-          <w:lang w:val="en-US"/>
-        </w:rPr>
-        <w:t xml:space="preserve">, E., </w:t>
+      <w:r>
+        <w:rPr>
+          <w:lang w:val="en-US"/>
+        </w:rPr>
+        <w:t xml:space="preserve">Acquesta, E., </w:t>
       </w:r>
       <w:r>
         <w:rPr>
@@ -2340,21 +2252,7 @@
         <w:rPr>
           <w:lang w:val="en-US"/>
         </w:rPr>
-        <w:t xml:space="preserve"> (SAND2022-12823). Sandia National </w:t>
-      </w:r>
-      <w:proofErr w:type="gramStart"/>
-      <w:r>
-        <w:rPr>
-          <w:lang w:val="en-US"/>
-        </w:rPr>
-        <w:t>Lab.(</w:t>
-      </w:r>
-      <w:proofErr w:type="gramEnd"/>
-      <w:r>
-        <w:rPr>
-          <w:lang w:val="en-US"/>
-        </w:rPr>
-        <w:t xml:space="preserve">SNL-NM), Albuquerque, NM (United States). </w:t>
+        <w:t xml:space="preserve"> (SAND2022-12823). Sandia National Lab.(SNL-NM), Albuquerque, NM (United States). </w:t>
       </w:r>
       <w:hyperlink r:id="rId30" w:history="1">
         <w:r>
@@ -2398,25 +2296,7 @@
           <w:iCs/>
           <w:lang w:val="en-US"/>
         </w:rPr>
-        <w:t xml:space="preserve">Deployment of </w:t>
-      </w:r>
-      <w:proofErr w:type="spellStart"/>
-      <w:r>
-        <w:rPr>
-          <w:i/>
-          <w:iCs/>
-          <w:lang w:val="en-US"/>
-        </w:rPr>
-        <w:t>Multifidelity</w:t>
-      </w:r>
-      <w:proofErr w:type="spellEnd"/>
-      <w:r>
-        <w:rPr>
-          <w:i/>
-          <w:iCs/>
-          <w:lang w:val="en-US"/>
-        </w:rPr>
-        <w:t xml:space="preserve"> Uncertainty Quantification for Thermal Battery Assessment Part I: Algorithms and Single Cell Results</w:t>
+        <w:t>Deployment of Multifidelity Uncertainty Quantification for Thermal Battery Assessment Part I: Algorithms and Single Cell Results</w:t>
       </w:r>
       <w:r>
         <w:rPr>
@@ -2644,21 +2524,7 @@
         <w:rPr>
           <w:lang w:val="en-US"/>
         </w:rPr>
-        <w:t xml:space="preserve">Safta, C., Ray, J., </w:t>
-      </w:r>
-      <w:proofErr w:type="spellStart"/>
-      <w:r>
-        <w:rPr>
-          <w:lang w:val="en-US"/>
-        </w:rPr>
-        <w:t>Acquesta</w:t>
-      </w:r>
-      <w:proofErr w:type="spellEnd"/>
-      <w:r>
-        <w:rPr>
-          <w:lang w:val="en-US"/>
-        </w:rPr>
-        <w:t xml:space="preserve">, E., Catanach, T. A., Chowdhary, K. S., Debusschere, B., Galvan, E., Geraci, G., Khalil, M., &amp; </w:t>
+        <w:t xml:space="preserve">Safta, C., Ray, J., Acquesta, E., Catanach, T. A., Chowdhary, K. S., Debusschere, B., Galvan, E., Geraci, G., Khalil, M., &amp; </w:t>
       </w:r>
       <w:r>
         <w:rPr>
@@ -3524,23 +3390,13 @@
           <w:szCs w:val="18"/>
         </w:rPr>
       </w:pPr>
-      <w:proofErr w:type="spellStart"/>
-      <w:r>
-        <w:rPr>
-          <w:rFonts w:ascii="Arial" w:hAnsi="Arial" w:cs="Arial"/>
-          <w:i/>
-          <w:szCs w:val="18"/>
-        </w:rPr>
-        <w:t>Multimodel</w:t>
-      </w:r>
-      <w:proofErr w:type="spellEnd"/>
-      <w:r>
-        <w:rPr>
-          <w:rFonts w:ascii="Arial" w:hAnsi="Arial" w:cs="Arial"/>
-          <w:i/>
-          <w:szCs w:val="18"/>
-        </w:rPr>
-        <w:t xml:space="preserve"> Methods for Uncertainty Quantification of Repository Systems. </w:t>
+      <w:r>
+        <w:rPr>
+          <w:rFonts w:ascii="Arial" w:hAnsi="Arial" w:cs="Arial"/>
+          <w:i/>
+          <w:szCs w:val="18"/>
+        </w:rPr>
+        <w:t xml:space="preserve">Multimodel Methods for Uncertainty Quantification of Repository Systems. </w:t>
       </w:r>
       <w:r>
         <w:rPr>
@@ -3604,27 +3460,7 @@
           <w:szCs w:val="18"/>
           <w:lang w:val="en-US"/>
         </w:rPr>
-        <w:t xml:space="preserve"> T. Portone, E. </w:t>
-      </w:r>
-      <w:proofErr w:type="spellStart"/>
-      <w:r>
-        <w:rPr>
-          <w:rFonts w:ascii="Arial" w:hAnsi="Arial" w:cs="Arial"/>
-          <w:iCs/>
-          <w:szCs w:val="18"/>
-          <w:lang w:val="en-US"/>
-        </w:rPr>
-        <w:t>Acquesta</w:t>
-      </w:r>
-      <w:proofErr w:type="spellEnd"/>
-      <w:r>
-        <w:rPr>
-          <w:rFonts w:ascii="Arial" w:hAnsi="Arial" w:cs="Arial"/>
-          <w:iCs/>
-          <w:szCs w:val="18"/>
-          <w:lang w:val="en-US"/>
-        </w:rPr>
-        <w:t>, R. Dandekar, C. Rackauckas. 8</w:t>
+        <w:t xml:space="preserve"> T. Portone, E. Acquesta, R. Dandekar, C. Rackauckas. 8</w:t>
       </w:r>
       <w:r>
         <w:rPr>
@@ -3701,27 +3537,7 @@
           <w:szCs w:val="18"/>
           <w:lang w:val="en-US"/>
         </w:rPr>
-        <w:t xml:space="preserve">T. Portone, E. </w:t>
-      </w:r>
-      <w:proofErr w:type="spellStart"/>
-      <w:r>
-        <w:rPr>
-          <w:rFonts w:ascii="Arial" w:hAnsi="Arial" w:cs="Arial"/>
-          <w:iCs/>
-          <w:szCs w:val="18"/>
-          <w:lang w:val="en-US"/>
-        </w:rPr>
-        <w:t>Acquesta</w:t>
-      </w:r>
-      <w:proofErr w:type="spellEnd"/>
-      <w:r>
-        <w:rPr>
-          <w:rFonts w:ascii="Arial" w:hAnsi="Arial" w:cs="Arial"/>
-          <w:iCs/>
-          <w:szCs w:val="18"/>
-          <w:lang w:val="en-US"/>
-        </w:rPr>
-        <w:t>, R. Dandekar, C. Rackauckas. USNCCM16, Virtual, July 2021.</w:t>
+        <w:t>T. Portone, E. Acquesta, R. Dandekar, C. Rackauckas. USNCCM16, Virtual, July 2021.</w:t>
       </w:r>
     </w:p>
     <w:p>
@@ -3741,27 +3557,7 @@
           <w:szCs w:val="18"/>
           <w:lang w:val="en-US"/>
         </w:rPr>
-        <w:t xml:space="preserve">Application of </w:t>
-      </w:r>
-      <w:proofErr w:type="spellStart"/>
-      <w:r>
-        <w:rPr>
-          <w:rFonts w:ascii="Arial" w:hAnsi="Arial" w:cs="Arial"/>
-          <w:i/>
-          <w:szCs w:val="18"/>
-          <w:lang w:val="en-US"/>
-        </w:rPr>
-        <w:t>Multifidelity</w:t>
-      </w:r>
-      <w:proofErr w:type="spellEnd"/>
-      <w:r>
-        <w:rPr>
-          <w:rFonts w:ascii="Arial" w:hAnsi="Arial" w:cs="Arial"/>
-          <w:i/>
-          <w:szCs w:val="18"/>
-          <w:lang w:val="en-US"/>
-        </w:rPr>
-        <w:t xml:space="preserve"> Uncertainty Quantification Methods to a Subsurface Transport Model. </w:t>
+        <w:t xml:space="preserve">Application of Multifidelity Uncertainty Quantification Methods to a Subsurface Transport Model. </w:t>
       </w:r>
       <w:r>
         <w:rPr>
@@ -3914,23 +3710,7 @@
           <w:rFonts w:ascii="Arial" w:hAnsi="Arial" w:cs="Arial"/>
           <w:szCs w:val="18"/>
         </w:rPr>
-        <w:t xml:space="preserve">T. Portone, D. McDougall, J. </w:t>
-      </w:r>
-      <w:proofErr w:type="spellStart"/>
-      <w:r>
-        <w:rPr>
-          <w:rFonts w:ascii="Arial" w:hAnsi="Arial" w:cs="Arial"/>
-          <w:szCs w:val="18"/>
-        </w:rPr>
-        <w:t>Rigelo</w:t>
-      </w:r>
-      <w:proofErr w:type="spellEnd"/>
-      <w:r>
-        <w:rPr>
-          <w:rFonts w:ascii="Arial" w:hAnsi="Arial" w:cs="Arial"/>
-          <w:szCs w:val="18"/>
-        </w:rPr>
-        <w:t>, T. Oliver, R.D. Moser. SIAM UQ 2016, Lausanne, Switzerland, April 2016.</w:t>
+        <w:t>T. Portone, D. McDougall, J. Rigelo, T. Oliver, R.D. Moser. SIAM UQ 2016, Lausanne, Switzerland, April 2016.</w:t>
       </w:r>
     </w:p>
     <w:p>
@@ -5276,25 +5056,7 @@
                 <w:szCs w:val="18"/>
                 <w:lang w:val="en-US"/>
               </w:rPr>
-              <w:t xml:space="preserve">; International Journal of Uncertainty Quantification; International Journal of </w:t>
-            </w:r>
-            <w:proofErr w:type="gramStart"/>
-            <w:r>
-              <w:rPr>
-                <w:rFonts w:ascii="Arial" w:hAnsi="Arial" w:cs="Arial"/>
-                <w:szCs w:val="18"/>
-                <w:lang w:val="en-US"/>
-              </w:rPr>
-              <w:t>High Performance</w:t>
-            </w:r>
-            <w:proofErr w:type="gramEnd"/>
-            <w:r>
-              <w:rPr>
-                <w:rFonts w:ascii="Arial" w:hAnsi="Arial" w:cs="Arial"/>
-                <w:szCs w:val="18"/>
-                <w:lang w:val="en-US"/>
-              </w:rPr>
-              <w:t xml:space="preserve"> Computing Applications; International Journal of Multiscale Computational Engineering</w:t>
+              <w:t>; International Journal of Uncertainty Quantification; International Journal of High Performance Computing Applications; International Journal of Multiscale Computational Engineering</w:t>
             </w:r>
           </w:p>
         </w:tc>

</xml_diff>